<commit_message>
Yearly exam 2026: final checks, PDF and Word exam and marking guide
- Section 3: swap the networks MC (PATH content) for a salary MC;
  title 'Mixed Topics (Chapters 1-8)'
- Visible thousands spaces, typographic apostrophes, units kept with
  their numbers, Word continuation title and heading rows
- Section 1 Q10: print the range formula; Section 2 Q11: write the prism
  volume as V = A x l so h means only the trapezium's height
- Every answer re-solved from the printed pages against the marking guide

Co-Authored-By: Claude Opus 5.5 <noreply@anthropic.com>
Claude-Session: https://claude.ai/code/session_01DsNxrheZyz6rzbZwHFY9rq
</commit_message>
<xml_diff>
--- a/Yearly exam 2026/Year9-5.2-Yearly-Exam-2026.docx
+++ b/Yearly exam 2026/Year9-5.2-Yearly-Exam-2026.docx
@@ -634,7 +634,7 @@
                       <w:b w:val="0"/>
                       <w:sz w:val="22"/>
                     </w:rPr>
-                    <w:t>Section 3 - Mixed: Chapters 1-8</w:t>
+                    <w:t>Section 3 - Mixed Topics</w:t>
                   </w:r>
                 </w:p>
               </w:tc>
@@ -1121,7 +1121,7 @@
                       <w:i w:val="0"/>
                       <w:sz w:val="22"/>
                     </w:rPr>
-                    <w:t>The time taken to swim 50 m</w:t>
+                    <w:t>The time taken to swim 50 m</w:t>
                   </w:r>
                 </w:p>
               </w:tc>
@@ -3212,7 +3212,7 @@
                 <w:i w:val="0"/>
                 <w:sz w:val="22"/>
               </w:rPr>
-              <w:t>A Year 9 class was asked how many times each student went to the beach last week.</w:t>
+              <w:t>Students were asked how many times they went to the beach last week.</w:t>
             </w:r>
           </w:p>
           <w:tbl>
@@ -3934,6 +3934,18 @@
               </w:rPr>
               <w:t xml:space="preserve"> ÷ total frequency</w:t>
             </w:r>
+            <w:r>
+              <w:br/>
+            </w:r>
+            <w:r>
+              <w:rPr>
+                <w:rFonts w:ascii="Cambria" w:hAnsi="Cambria" w:cs="Cambria" w:eastAsia="Cambria"/>
+                <w:b w:val="0"/>
+                <w:i w:val="0"/>
+                <w:sz w:val="22"/>
+              </w:rPr>
+              <w:t>Range = highest score − lowest score</w:t>
+            </w:r>
           </w:p>
         </w:tc>
         <w:tc>
@@ -7156,7 +7168,7 @@
                             <w:i w:val="0"/>
                             <w:sz w:val="22"/>
                           </w:rPr>
-                          <w:t>±25 mL</w:t>
+                          <w:t>±25 mL</w:t>
                         </w:r>
                       </w:p>
                     </w:tc>
@@ -7195,7 +7207,7 @@
                             <w:i w:val="0"/>
                             <w:sz w:val="22"/>
                           </w:rPr>
-                          <w:t>±50 mL</w:t>
+                          <w:t>±50 mL</w:t>
                         </w:r>
                       </w:p>
                     </w:tc>
@@ -7234,7 +7246,7 @@
                             <w:i w:val="0"/>
                             <w:sz w:val="22"/>
                           </w:rPr>
-                          <w:t>±100 mL</w:t>
+                          <w:t>±100 mL</w:t>
                         </w:r>
                       </w:p>
                     </w:tc>
@@ -7273,7 +7285,7 @@
                             <w:i w:val="0"/>
                             <w:sz w:val="22"/>
                           </w:rPr>
-                          <w:t>±0.5 mL</w:t>
+                          <w:t>±0.5 mL</w:t>
                         </w:r>
                       </w:p>
                     </w:tc>
@@ -11151,7 +11163,25 @@
                 <w:i/>
                 <w:sz w:val="22"/>
               </w:rPr>
-              <w:t>Ah</w:t>
+              <w:t>A</w:t>
+            </w:r>
+            <w:r>
+              <w:rPr>
+                <w:rFonts w:ascii="Cambria" w:hAnsi="Cambria" w:cs="Cambria" w:eastAsia="Cambria"/>
+                <w:b w:val="0"/>
+                <w:i w:val="0"/>
+                <w:sz w:val="22"/>
+              </w:rPr>
+              <w:t xml:space="preserve"> × </w:t>
+            </w:r>
+            <w:r>
+              <w:rPr>
+                <w:rFonts w:ascii="Cambria" w:hAnsi="Cambria" w:cs="Cambria" w:eastAsia="Cambria"/>
+                <w:b w:val="0"/>
+                <w:i/>
+                <w:sz w:val="22"/>
+              </w:rPr>
+              <w:t>l</w:t>
             </w:r>
             <w:r>
               <w:br/>
@@ -11190,7 +11220,7 @@
                 <w:i/>
                 <w:sz w:val="22"/>
               </w:rPr>
-              <w:t>h</w:t>
+              <w:t>l</w:t>
             </w:r>
             <w:r>
               <w:rPr>
@@ -11297,7 +11327,7 @@
                 <w:i w:val="0"/>
                 <w:sz w:val="22"/>
               </w:rPr>
-              <w:t>Note: 1 L = 1000 cm³</w:t>
+              <w:t>Note: 1 L = 1000 cm³</w:t>
             </w:r>
           </w:p>
         </w:tc>
@@ -11483,7 +11513,7 @@
                 <w:color w:val="FFFFFF"/>
                 <w:sz w:val="32"/>
               </w:rPr>
-              <w:t>Section 3: Mixed: Chapters 1-8</w:t>
+              <w:t>Section 3: Mixed Topics (Chapters 1–8)</w:t>
             </w:r>
           </w:p>
         </w:tc>
@@ -13105,12 +13135,43 @@
           </w:tcPr>
           <w:p>
             <w:pPr>
-              <w:spacing w:before="0" w:after="0" w:lineRule="exact" w:line="34"/>
+              <w:spacing w:before="0" w:after="68" w:line="240" w:lineRule="auto"/>
+              <w:jc w:val="center"/>
+            </w:pPr>
+            <w:r>
+              <w:rPr>
+                <w:rFonts w:ascii="Cambria" w:hAnsi="Cambria" w:cs="Cambria" w:eastAsia="Cambria"/>
+                <w:b w:val="0"/>
+                <w:i w:val="0"/>
+                <w:sz w:val="22"/>
+              </w:rPr>
+              <w:t>Ella is a nurse. She earns an annual salary of $81 640. How much is she paid per fortnight?</w:t>
+            </w:r>
+          </w:p>
+          <w:p>
+            <w:pPr>
+              <w:spacing w:before="0" w:after="68" w:line="240" w:lineRule="auto"/>
+              <w:jc w:val="center"/>
+            </w:pPr>
+            <w:r>
+              <w:rPr>
+                <w:rFonts w:ascii="Cambria" w:hAnsi="Cambria" w:cs="Cambria" w:eastAsia="Cambria"/>
+                <w:b w:val="0"/>
+                <w:i w:val="0"/>
+                <w:sz w:val="22"/>
+              </w:rPr>
+              <w:t>Note: 1 year = 52 weeks = 26 fortnights = 12 months</w:t>
+            </w:r>
+          </w:p>
+          <w:p>
+            <w:pPr>
+              <w:spacing w:before="0" w:after="0" w:lineRule="exact" w:line="204"/>
             </w:pPr>
           </w:p>
           <w:tbl>
             <w:tblPr>
-              <w:tblW w:w="9031" w:type="dxa"/>
+              <w:tblW w:w="8294" w:type="dxa"/>
+              <w:tblInd w:w="510" w:type="dxa"/>
               <w:tblBorders>
                 <w:top w:val="nil"/>
                 <w:left w:val="nil"/>
@@ -13129,23 +13190,40 @@
               <w:tblLook w:firstColumn="1" w:firstRow="1" w:lastColumn="0" w:lastRow="0" w:noHBand="0" w:noVBand="1" w:val="04A0"/>
             </w:tblPr>
             <w:tblGrid>
-              <w:gridCol w:w="5568"/>
-              <w:gridCol w:w="3463"/>
+              <w:gridCol w:w="2074"/>
+              <w:gridCol w:w="2074"/>
+              <w:gridCol w:w="2074"/>
+              <w:gridCol w:w="2074"/>
             </w:tblGrid>
             <w:tr>
               <w:tc>
                 <w:tcPr>
-                  <w:tcW w:type="dxa" w:w="5568"/>
-                  <w:tcMar>
-                    <w:right w:w="227" w:type="dxa"/>
-                  </w:tcMar>
-                  <w:vAlign w:val="center"/>
+                  <w:tcW w:type="dxa" w:w="2074"/>
                 </w:tcPr>
                 <w:p>
                   <w:pPr>
-                    <w:spacing w:before="0" w:after="68" w:line="240" w:lineRule="auto"/>
-                    <w:jc w:val="center"/>
+                    <w:tabs>
+                      <w:tab w:pos="351" w:val="left"/>
+                    </w:tabs>
+                    <w:spacing w:before="0" w:after="0" w:line="240" w:lineRule="auto"/>
+                    <w:ind w:left="351" w:hanging="351"/>
+                    <w:jc w:val="left"/>
                   </w:pPr>
+                  <w:r>
+                    <w:rPr>
+                      <w:rFonts w:ascii="Cambria" w:hAnsi="Cambria" w:cs="Cambria" w:eastAsia="Cambria"/>
+                      <w:b w:val="0"/>
+                      <w:sz w:val="22"/>
+                    </w:rPr>
+                    <w:t>A.</w:t>
+                  </w:r>
+                  <w:r>
+                    <w:rPr>
+                      <w:rFonts w:ascii="Cambria" w:hAnsi="Cambria" w:cs="Cambria" w:eastAsia="Cambria"/>
+                      <w:sz w:val="22"/>
+                    </w:rPr>
+                    <w:tab/>
+                  </w:r>
                   <w:r>
                     <w:rPr>
                       <w:rFonts w:ascii="Cambria" w:hAnsi="Cambria" w:cs="Cambria" w:eastAsia="Cambria"/>
@@ -13153,14 +13231,38 @@
                       <w:i w:val="0"/>
                       <w:sz w:val="22"/>
                     </w:rPr>
-                    <w:t>What is the sum of the degrees of all the vertices in this network?</w:t>
+                    <w:t>$1570.00</w:t>
                   </w:r>
                 </w:p>
+              </w:tc>
+              <w:tc>
+                <w:tcPr>
+                  <w:tcW w:type="dxa" w:w="2074"/>
+                </w:tcPr>
                 <w:p>
                   <w:pPr>
-                    <w:spacing w:before="0" w:after="68" w:line="240" w:lineRule="auto"/>
-                    <w:jc w:val="center"/>
+                    <w:tabs>
+                      <w:tab w:pos="351" w:val="left"/>
+                    </w:tabs>
+                    <w:spacing w:before="0" w:after="0" w:line="240" w:lineRule="auto"/>
+                    <w:ind w:left="351" w:hanging="351"/>
+                    <w:jc w:val="left"/>
                   </w:pPr>
+                  <w:r>
+                    <w:rPr>
+                      <w:rFonts w:ascii="Cambria" w:hAnsi="Cambria" w:cs="Cambria" w:eastAsia="Cambria"/>
+                      <w:b w:val="0"/>
+                      <w:sz w:val="22"/>
+                    </w:rPr>
+                    <w:t>B.</w:t>
+                  </w:r>
+                  <w:r>
+                    <w:rPr>
+                      <w:rFonts w:ascii="Cambria" w:hAnsi="Cambria" w:cs="Cambria" w:eastAsia="Cambria"/>
+                      <w:sz w:val="22"/>
+                    </w:rPr>
+                    <w:tab/>
+                  </w:r>
                   <w:r>
                     <w:rPr>
                       <w:rFonts w:ascii="Cambria" w:hAnsi="Cambria" w:cs="Cambria" w:eastAsia="Cambria"/>
@@ -13168,249 +13270,85 @@
                       <w:i w:val="0"/>
                       <w:sz w:val="22"/>
                     </w:rPr>
-                    <w:t>Note: the degree of a vertex is the number of edges that meet at that vertex.</w:t>
+                    <w:t>$3140.00</w:t>
                   </w:r>
-                </w:p>
-                <w:p>
-                  <w:pPr>
-                    <w:spacing w:before="0" w:after="0" w:lineRule="exact" w:line="204"/>
-                  </w:pPr>
-                </w:p>
-                <w:tbl>
-                  <w:tblPr>
-                    <w:tblW w:w="4605" w:type="dxa"/>
-                    <w:tblInd w:w="510" w:type="dxa"/>
-                    <w:tblBorders>
-                      <w:top w:val="nil"/>
-                      <w:left w:val="nil"/>
-                      <w:bottom w:val="nil"/>
-                      <w:right w:val="nil"/>
-                      <w:insideH w:val="nil"/>
-                      <w:insideV w:val="nil"/>
-                    </w:tblBorders>
-                    <w:tblLayout w:type="fixed"/>
-                    <w:tblCellMar>
-                      <w:top w:w="0" w:type="dxa"/>
-                      <w:left w:w="0" w:type="dxa"/>
-                      <w:bottom w:w="0" w:type="dxa"/>
-                      <w:right w:w="0" w:type="dxa"/>
-                    </w:tblCellMar>
-                    <w:tblLook w:firstColumn="1" w:firstRow="1" w:lastColumn="0" w:lastRow="0" w:noHBand="0" w:noVBand="1" w:val="04A0"/>
-                  </w:tblPr>
-                  <w:tblGrid>
-                    <w:gridCol w:w="1151"/>
-                    <w:gridCol w:w="1151"/>
-                    <w:gridCol w:w="1151"/>
-                    <w:gridCol w:w="1151"/>
-                  </w:tblGrid>
-                  <w:tr>
-                    <w:tc>
-                      <w:tcPr>
-                        <w:tcW w:type="dxa" w:w="1151"/>
-                      </w:tcPr>
-                      <w:p>
-                        <w:pPr>
-                          <w:tabs>
-                            <w:tab w:pos="351" w:val="left"/>
-                          </w:tabs>
-                          <w:spacing w:before="0" w:after="0" w:line="240" w:lineRule="auto"/>
-                          <w:ind w:left="351" w:hanging="351"/>
-                          <w:jc w:val="left"/>
-                        </w:pPr>
-                        <w:r>
-                          <w:rPr>
-                            <w:rFonts w:ascii="Cambria" w:hAnsi="Cambria" w:cs="Cambria" w:eastAsia="Cambria"/>
-                            <w:b w:val="0"/>
-                            <w:sz w:val="22"/>
-                          </w:rPr>
-                          <w:t>A.</w:t>
-                        </w:r>
-                        <w:r>
-                          <w:rPr>
-                            <w:rFonts w:ascii="Cambria" w:hAnsi="Cambria" w:cs="Cambria" w:eastAsia="Cambria"/>
-                            <w:sz w:val="22"/>
-                          </w:rPr>
-                          <w:tab/>
-                        </w:r>
-                        <w:r>
-                          <w:rPr>
-                            <w:rFonts w:ascii="Cambria" w:hAnsi="Cambria" w:cs="Cambria" w:eastAsia="Cambria"/>
-                            <w:b w:val="0"/>
-                            <w:i w:val="0"/>
-                            <w:sz w:val="22"/>
-                          </w:rPr>
-                          <w:t>6</w:t>
-                        </w:r>
-                      </w:p>
-                    </w:tc>
-                    <w:tc>
-                      <w:tcPr>
-                        <w:tcW w:type="dxa" w:w="1151"/>
-                      </w:tcPr>
-                      <w:p>
-                        <w:pPr>
-                          <w:tabs>
-                            <w:tab w:pos="351" w:val="left"/>
-                          </w:tabs>
-                          <w:spacing w:before="0" w:after="0" w:line="240" w:lineRule="auto"/>
-                          <w:ind w:left="351" w:hanging="351"/>
-                          <w:jc w:val="left"/>
-                        </w:pPr>
-                        <w:r>
-                          <w:rPr>
-                            <w:rFonts w:ascii="Cambria" w:hAnsi="Cambria" w:cs="Cambria" w:eastAsia="Cambria"/>
-                            <w:b w:val="0"/>
-                            <w:sz w:val="22"/>
-                          </w:rPr>
-                          <w:t>B.</w:t>
-                        </w:r>
-                        <w:r>
-                          <w:rPr>
-                            <w:rFonts w:ascii="Cambria" w:hAnsi="Cambria" w:cs="Cambria" w:eastAsia="Cambria"/>
-                            <w:sz w:val="22"/>
-                          </w:rPr>
-                          <w:tab/>
-                        </w:r>
-                        <w:r>
-                          <w:rPr>
-                            <w:rFonts w:ascii="Cambria" w:hAnsi="Cambria" w:cs="Cambria" w:eastAsia="Cambria"/>
-                            <w:b w:val="0"/>
-                            <w:i w:val="0"/>
-                            <w:sz w:val="22"/>
-                          </w:rPr>
-                          <w:t>8</w:t>
-                        </w:r>
-                      </w:p>
-                    </w:tc>
-                    <w:tc>
-                      <w:tcPr>
-                        <w:tcW w:type="dxa" w:w="1151"/>
-                      </w:tcPr>
-                      <w:p>
-                        <w:pPr>
-                          <w:tabs>
-                            <w:tab w:pos="351" w:val="left"/>
-                          </w:tabs>
-                          <w:spacing w:before="0" w:after="0" w:line="240" w:lineRule="auto"/>
-                          <w:ind w:left="351" w:hanging="351"/>
-                          <w:jc w:val="left"/>
-                        </w:pPr>
-                        <w:r>
-                          <w:rPr>
-                            <w:rFonts w:ascii="Cambria" w:hAnsi="Cambria" w:cs="Cambria" w:eastAsia="Cambria"/>
-                            <w:b w:val="0"/>
-                            <w:sz w:val="22"/>
-                          </w:rPr>
-                          <w:t>C.</w:t>
-                        </w:r>
-                        <w:r>
-                          <w:rPr>
-                            <w:rFonts w:ascii="Cambria" w:hAnsi="Cambria" w:cs="Cambria" w:eastAsia="Cambria"/>
-                            <w:sz w:val="22"/>
-                          </w:rPr>
-                          <w:tab/>
-                        </w:r>
-                        <w:r>
-                          <w:rPr>
-                            <w:rFonts w:ascii="Cambria" w:hAnsi="Cambria" w:cs="Cambria" w:eastAsia="Cambria"/>
-                            <w:b w:val="0"/>
-                            <w:i w:val="0"/>
-                            <w:sz w:val="22"/>
-                          </w:rPr>
-                          <w:t>12</w:t>
-                        </w:r>
-                      </w:p>
-                    </w:tc>
-                    <w:tc>
-                      <w:tcPr>
-                        <w:tcW w:type="dxa" w:w="1151"/>
-                      </w:tcPr>
-                      <w:p>
-                        <w:pPr>
-                          <w:tabs>
-                            <w:tab w:pos="351" w:val="left"/>
-                          </w:tabs>
-                          <w:spacing w:before="0" w:after="0" w:line="240" w:lineRule="auto"/>
-                          <w:ind w:left="351" w:hanging="351"/>
-                          <w:jc w:val="left"/>
-                        </w:pPr>
-                        <w:r>
-                          <w:rPr>
-                            <w:rFonts w:ascii="Cambria" w:hAnsi="Cambria" w:cs="Cambria" w:eastAsia="Cambria"/>
-                            <w:b w:val="0"/>
-                            <w:sz w:val="22"/>
-                          </w:rPr>
-                          <w:t>D.</w:t>
-                        </w:r>
-                        <w:r>
-                          <w:rPr>
-                            <w:rFonts w:ascii="Cambria" w:hAnsi="Cambria" w:cs="Cambria" w:eastAsia="Cambria"/>
-                            <w:sz w:val="22"/>
-                          </w:rPr>
-                          <w:tab/>
-                        </w:r>
-                        <w:r>
-                          <w:rPr>
-                            <w:rFonts w:ascii="Cambria" w:hAnsi="Cambria" w:cs="Cambria" w:eastAsia="Cambria"/>
-                            <w:b w:val="0"/>
-                            <w:i w:val="0"/>
-                            <w:sz w:val="22"/>
-                          </w:rPr>
-                          <w:t>16</w:t>
-                        </w:r>
-                      </w:p>
-                    </w:tc>
-                  </w:tr>
-                </w:tbl>
-                <w:p>
-                  <w:pPr>
-                    <w:spacing w:before="0" w:after="0" w:lineRule="exact" w:line="34"/>
-                  </w:pPr>
                 </w:p>
               </w:tc>
               <w:tc>
                 <w:tcPr>
-                  <w:tcW w:type="dxa" w:w="3463"/>
-                  <w:vAlign w:val="center"/>
+                  <w:tcW w:type="dxa" w:w="2074"/>
                 </w:tcPr>
                 <w:p>
                   <w:pPr>
-                    <w:spacing w:before="91" w:after="57" w:line="240" w:lineRule="auto"/>
-                    <w:jc w:val="center"/>
+                    <w:tabs>
+                      <w:tab w:pos="351" w:val="left"/>
+                    </w:tabs>
+                    <w:spacing w:before="0" w:after="0" w:line="240" w:lineRule="auto"/>
+                    <w:ind w:left="351" w:hanging="351"/>
+                    <w:jc w:val="left"/>
                   </w:pPr>
                   <w:r>
-                    <w:drawing>
-                      <wp:inline xmlns:a="http://schemas.openxmlformats.org/drawingml/2006/main" xmlns:pic="http://schemas.openxmlformats.org/drawingml/2006/picture" distT="0" distB="0" distL="0" distR="0">
-                        <wp:extent cx="2126880" cy="1206245"/>
-                        <wp:docPr id="17" name="Picture 17"/>
-                        <wp:cNvGraphicFramePr>
-                          <a:graphicFrameLocks noChangeAspect="1"/>
-                        </wp:cNvGraphicFramePr>
-                        <a:graphic>
-                          <a:graphicData uri="http://schemas.openxmlformats.org/drawingml/2006/picture">
-                            <pic:pic>
-                              <pic:nvPicPr>
-                                <pic:cNvPr id="0" name="s3-q5.png"/>
-                                <pic:cNvPicPr/>
-                              </pic:nvPicPr>
-                              <pic:blipFill>
-                                <a:blip r:embed="rId26"/>
-                                <a:stretch>
-                                  <a:fillRect/>
-                                </a:stretch>
-                              </pic:blipFill>
-                              <pic:spPr>
-                                <a:xfrm>
-                                  <a:off x="0" y="0"/>
-                                  <a:ext cx="2126880" cy="1206245"/>
-                                </a:xfrm>
-                                <a:prstGeom prst="rect"/>
-                              </pic:spPr>
-                            </pic:pic>
-                          </a:graphicData>
-                        </a:graphic>
-                      </wp:inline>
-                    </w:drawing>
+                    <w:rPr>
+                      <w:rFonts w:ascii="Cambria" w:hAnsi="Cambria" w:cs="Cambria" w:eastAsia="Cambria"/>
+                      <w:b w:val="0"/>
+                      <w:sz w:val="22"/>
+                    </w:rPr>
+                    <w:t>C.</w:t>
+                  </w:r>
+                  <w:r>
+                    <w:rPr>
+                      <w:rFonts w:ascii="Cambria" w:hAnsi="Cambria" w:cs="Cambria" w:eastAsia="Cambria"/>
+                      <w:sz w:val="22"/>
+                    </w:rPr>
+                    <w:tab/>
+                  </w:r>
+                  <w:r>
+                    <w:rPr>
+                      <w:rFonts w:ascii="Cambria" w:hAnsi="Cambria" w:cs="Cambria" w:eastAsia="Cambria"/>
+                      <w:b w:val="0"/>
+                      <w:i w:val="0"/>
+                      <w:sz w:val="22"/>
+                    </w:rPr>
+                    <w:t>$3401.67</w:t>
+                  </w:r>
+                </w:p>
+              </w:tc>
+              <w:tc>
+                <w:tcPr>
+                  <w:tcW w:type="dxa" w:w="2074"/>
+                </w:tcPr>
+                <w:p>
+                  <w:pPr>
+                    <w:tabs>
+                      <w:tab w:pos="351" w:val="left"/>
+                    </w:tabs>
+                    <w:spacing w:before="0" w:after="0" w:line="240" w:lineRule="auto"/>
+                    <w:ind w:left="351" w:hanging="351"/>
+                    <w:jc w:val="left"/>
+                  </w:pPr>
+                  <w:r>
+                    <w:rPr>
+                      <w:rFonts w:ascii="Cambria" w:hAnsi="Cambria" w:cs="Cambria" w:eastAsia="Cambria"/>
+                      <w:b w:val="0"/>
+                      <w:sz w:val="22"/>
+                    </w:rPr>
+                    <w:t>D.</w:t>
+                  </w:r>
+                  <w:r>
+                    <w:rPr>
+                      <w:rFonts w:ascii="Cambria" w:hAnsi="Cambria" w:cs="Cambria" w:eastAsia="Cambria"/>
+                      <w:sz w:val="22"/>
+                    </w:rPr>
+                    <w:tab/>
+                  </w:r>
+                  <w:r>
+                    <w:rPr>
+                      <w:rFonts w:ascii="Cambria" w:hAnsi="Cambria" w:cs="Cambria" w:eastAsia="Cambria"/>
+                      <w:b w:val="0"/>
+                      <w:i w:val="0"/>
+                      <w:sz w:val="22"/>
+                    </w:rPr>
+                    <w:t>$6803.33</w:t>
                   </w:r>
                 </w:p>
               </w:tc>
@@ -13683,6 +13621,128 @@
                 <w:sz w:val="22"/>
               </w:rPr>
               <w:t xml:space="preserve"> − 6)</w:t>
+            </w:r>
+          </w:p>
+        </w:tc>
+        <w:tc>
+          <w:tcPr>
+            <w:tcW w:type="dxa" w:w="5630"/>
+          </w:tcPr>
+          <w:p/>
+        </w:tc>
+        <w:tc>
+          <w:tcPr>
+            <w:tcW w:type="dxa" w:w="680"/>
+            <w:tcMar>
+              <w:left w:w="23" w:type="dxa"/>
+              <w:right w:w="23" w:type="dxa"/>
+            </w:tcMar>
+            <w:vAlign w:val="center"/>
+          </w:tcPr>
+          <w:p>
+            <w:pPr>
+              <w:spacing w:before="0" w:after="0" w:line="240" w:lineRule="auto"/>
+              <w:jc w:val="center"/>
+            </w:pPr>
+            <w:r>
+              <w:rPr>
+                <w:rFonts w:ascii="Cambria" w:hAnsi="Cambria" w:cs="Cambria" w:eastAsia="Cambria"/>
+                <w:b w:val="0"/>
+                <w:sz w:val="22"/>
+              </w:rPr>
+              <w:t>2</w:t>
+            </w:r>
+          </w:p>
+        </w:tc>
+      </w:tr>
+      <w:tr>
+        <w:trPr>
+          <w:cantSplit/>
+          <w:trHeight w:val="2041" w:hRule="atLeast"/>
+        </w:trPr>
+        <w:tc>
+          <w:tcPr>
+            <w:tcW w:type="dxa" w:w="380"/>
+            <w:tcMar>
+              <w:left w:w="23" w:type="dxa"/>
+              <w:right w:w="23" w:type="dxa"/>
+            </w:tcMar>
+            <w:vAlign w:val="center"/>
+          </w:tcPr>
+          <w:p>
+            <w:pPr>
+              <w:spacing w:before="0" w:after="0" w:line="240" w:lineRule="auto"/>
+              <w:jc w:val="center"/>
+            </w:pPr>
+            <w:r>
+              <w:rPr>
+                <w:rFonts w:ascii="Cambria" w:hAnsi="Cambria" w:cs="Cambria" w:eastAsia="Cambria"/>
+                <w:b w:val="0"/>
+                <w:sz w:val="22"/>
+              </w:rPr>
+              <w:t>7</w:t>
+            </w:r>
+          </w:p>
+        </w:tc>
+        <w:tc>
+          <w:tcPr>
+            <w:tcW w:type="dxa" w:w="3742"/>
+          </w:tcPr>
+          <w:p>
+            <w:pPr>
+              <w:spacing w:before="0" w:after="68" w:line="240" w:lineRule="auto"/>
+              <w:jc w:val="left"/>
+            </w:pPr>
+            <w:r>
+              <w:rPr>
+                <w:rFonts w:ascii="Cambria" w:hAnsi="Cambria" w:cs="Cambria" w:eastAsia="Cambria"/>
+                <w:b w:val="0"/>
+                <w:i w:val="0"/>
+                <w:sz w:val="22"/>
+              </w:rPr>
+              <w:t>Liam invests $7250 for 3 years at 4.2% p.a. simple interest. Calculate the interest he earns.</w:t>
+            </w:r>
+          </w:p>
+          <w:p>
+            <w:pPr>
+              <w:spacing w:before="91" w:after="68" w:line="240" w:lineRule="auto"/>
+              <w:jc w:val="left"/>
+            </w:pPr>
+            <w:r>
+              <w:rPr>
+                <w:rFonts w:ascii="Cambria" w:hAnsi="Cambria" w:cs="Cambria" w:eastAsia="Cambria"/>
+                <w:b w:val="0"/>
+                <w:i w:val="0"/>
+                <w:sz w:val="22"/>
+              </w:rPr>
+              <w:t xml:space="preserve">Note: Simple interest: </w:t>
+            </w:r>
+            <w:r>
+              <w:rPr>
+                <w:rFonts w:ascii="Cambria" w:hAnsi="Cambria" w:cs="Cambria" w:eastAsia="Cambria"/>
+                <w:b w:val="0"/>
+                <w:i/>
+                <w:sz w:val="22"/>
+              </w:rPr>
+              <w:t>I</w:t>
+            </w:r>
+            <w:r>
+              <w:rPr>
+                <w:rFonts w:ascii="Cambria" w:hAnsi="Cambria" w:cs="Cambria" w:eastAsia="Cambria"/>
+                <w:b w:val="0"/>
+                <w:i w:val="0"/>
+                <w:sz w:val="22"/>
+              </w:rPr>
+              <w:t xml:space="preserve"> = </w:t>
+            </w:r>
+            <w:r>
+              <w:rPr>
+                <w:rFonts w:ascii="Cambria" w:hAnsi="Cambria" w:cs="Cambria" w:eastAsia="Cambria"/>
+                <w:b w:val="0"/>
+                <w:i/>
+                <w:sz w:val="22"/>
+              </w:rPr>
+              <w:t>Prn</w:t>
             </w:r>
           </w:p>
         </w:tc>
@@ -13798,7 +13858,7 @@
                 <w:color w:val="FFFFFF"/>
                 <w:sz w:val="32"/>
               </w:rPr>
-              <w:t>Section 3: Mixed: Chapters 1-8 (continued)</w:t>
+              <w:t>Section 3: Mixed Topics (Chapters 1–8) (continued)</w:t>
             </w:r>
           </w:p>
         </w:tc>
@@ -13923,7 +13983,7 @@
                 <w:b w:val="0"/>
                 <w:sz w:val="22"/>
               </w:rPr>
-              <w:t>7</w:t>
+              <w:t>8</w:t>
             </w:r>
           </w:p>
         </w:tc>
@@ -13943,128 +14003,6 @@
                 <w:i w:val="0"/>
                 <w:sz w:val="22"/>
               </w:rPr>
-              <w:t>Liam invests $7250 for 3 years at 4.2% p.a. simple interest. Calculate the interest he earns.</w:t>
-            </w:r>
-          </w:p>
-          <w:p>
-            <w:pPr>
-              <w:spacing w:before="91" w:after="68" w:line="240" w:lineRule="auto"/>
-              <w:jc w:val="left"/>
-            </w:pPr>
-            <w:r>
-              <w:rPr>
-                <w:rFonts w:ascii="Cambria" w:hAnsi="Cambria" w:cs="Cambria" w:eastAsia="Cambria"/>
-                <w:b w:val="0"/>
-                <w:i w:val="0"/>
-                <w:sz w:val="22"/>
-              </w:rPr>
-              <w:t xml:space="preserve">Note: Simple interest: </w:t>
-            </w:r>
-            <w:r>
-              <w:rPr>
-                <w:rFonts w:ascii="Cambria" w:hAnsi="Cambria" w:cs="Cambria" w:eastAsia="Cambria"/>
-                <w:b w:val="0"/>
-                <w:i/>
-                <w:sz w:val="22"/>
-              </w:rPr>
-              <w:t>I</w:t>
-            </w:r>
-            <w:r>
-              <w:rPr>
-                <w:rFonts w:ascii="Cambria" w:hAnsi="Cambria" w:cs="Cambria" w:eastAsia="Cambria"/>
-                <w:b w:val="0"/>
-                <w:i w:val="0"/>
-                <w:sz w:val="22"/>
-              </w:rPr>
-              <w:t xml:space="preserve"> = </w:t>
-            </w:r>
-            <w:r>
-              <w:rPr>
-                <w:rFonts w:ascii="Cambria" w:hAnsi="Cambria" w:cs="Cambria" w:eastAsia="Cambria"/>
-                <w:b w:val="0"/>
-                <w:i/>
-                <w:sz w:val="22"/>
-              </w:rPr>
-              <w:t>Prn</w:t>
-            </w:r>
-          </w:p>
-        </w:tc>
-        <w:tc>
-          <w:tcPr>
-            <w:tcW w:type="dxa" w:w="5630"/>
-          </w:tcPr>
-          <w:p/>
-        </w:tc>
-        <w:tc>
-          <w:tcPr>
-            <w:tcW w:type="dxa" w:w="680"/>
-            <w:tcMar>
-              <w:left w:w="23" w:type="dxa"/>
-              <w:right w:w="23" w:type="dxa"/>
-            </w:tcMar>
-            <w:vAlign w:val="center"/>
-          </w:tcPr>
-          <w:p>
-            <w:pPr>
-              <w:spacing w:before="0" w:after="0" w:line="240" w:lineRule="auto"/>
-              <w:jc w:val="center"/>
-            </w:pPr>
-            <w:r>
-              <w:rPr>
-                <w:rFonts w:ascii="Cambria" w:hAnsi="Cambria" w:cs="Cambria" w:eastAsia="Cambria"/>
-                <w:b w:val="0"/>
-                <w:sz w:val="22"/>
-              </w:rPr>
-              <w:t>2</w:t>
-            </w:r>
-          </w:p>
-        </w:tc>
-      </w:tr>
-      <w:tr>
-        <w:trPr>
-          <w:cantSplit/>
-          <w:trHeight w:val="2041" w:hRule="atLeast"/>
-        </w:trPr>
-        <w:tc>
-          <w:tcPr>
-            <w:tcW w:type="dxa" w:w="380"/>
-            <w:tcMar>
-              <w:left w:w="23" w:type="dxa"/>
-              <w:right w:w="23" w:type="dxa"/>
-            </w:tcMar>
-            <w:vAlign w:val="center"/>
-          </w:tcPr>
-          <w:p>
-            <w:pPr>
-              <w:spacing w:before="0" w:after="0" w:line="240" w:lineRule="auto"/>
-              <w:jc w:val="center"/>
-            </w:pPr>
-            <w:r>
-              <w:rPr>
-                <w:rFonts w:ascii="Cambria" w:hAnsi="Cambria" w:cs="Cambria" w:eastAsia="Cambria"/>
-                <w:b w:val="0"/>
-                <w:sz w:val="22"/>
-              </w:rPr>
-              <w:t>8</w:t>
-            </w:r>
-          </w:p>
-        </w:tc>
-        <w:tc>
-          <w:tcPr>
-            <w:tcW w:type="dxa" w:w="3742"/>
-          </w:tcPr>
-          <w:p>
-            <w:pPr>
-              <w:spacing w:before="0" w:after="68" w:line="240" w:lineRule="auto"/>
-              <w:jc w:val="left"/>
-            </w:pPr>
-            <w:r>
-              <w:rPr>
-                <w:rFonts w:ascii="Cambria" w:hAnsi="Cambria" w:cs="Cambria" w:eastAsia="Cambria"/>
-                <w:b w:val="0"/>
-                <w:i w:val="0"/>
-                <w:sz w:val="22"/>
-              </w:rPr>
               <w:t xml:space="preserve">Find the value of </w:t>
             </w:r>
             <w:r>
@@ -14095,7 +14033,7 @@
               <w:drawing>
                 <wp:inline xmlns:a="http://schemas.openxmlformats.org/drawingml/2006/main" xmlns:pic="http://schemas.openxmlformats.org/drawingml/2006/picture" distT="0" distB="0" distL="0" distR="0">
                   <wp:extent cx="1801080" cy="1231041"/>
-                  <wp:docPr id="18" name="Picture 18"/>
+                  <wp:docPr id="17" name="Picture 17"/>
                   <wp:cNvGraphicFramePr>
                     <a:graphicFrameLocks noChangeAspect="1"/>
                   </wp:cNvGraphicFramePr>
@@ -14107,7 +14045,7 @@
                           <pic:cNvPicPr/>
                         </pic:nvPicPr>
                         <pic:blipFill>
-                          <a:blip r:embed="rId27"/>
+                          <a:blip r:embed="rId26"/>
                           <a:stretch>
                             <a:fillRect/>
                           </a:stretch>
@@ -14179,7 +14117,7 @@
                 <m:num>
                   <m:r>
                     <m:rPr>
-                      <m:sty m:val="p"/>
+                      <m:nor/>
                     </m:rPr>
                     <w:rPr>
                       <w:rFonts w:ascii="Cambria Math" w:hAnsi="Cambria Math"/>
@@ -14191,7 +14129,7 @@
                 <m:den>
                   <m:r>
                     <m:rPr>
-                      <m:sty m:val="p"/>
+                      <m:nor/>
                     </m:rPr>
                     <w:rPr>
                       <w:rFonts w:ascii="Cambria Math" w:hAnsi="Cambria Math"/>
@@ -14250,7 +14188,7 @@
                 <m:num>
                   <m:r>
                     <m:rPr>
-                      <m:sty m:val="p"/>
+                      <m:nor/>
                     </m:rPr>
                     <w:rPr>
                       <w:rFonts w:ascii="Cambria Math" w:hAnsi="Cambria Math"/>
@@ -14262,7 +14200,7 @@
                 <m:den>
                   <m:r>
                     <m:rPr>
-                      <m:sty m:val="p"/>
+                      <m:nor/>
                     </m:rPr>
                     <w:rPr>
                       <w:rFonts w:ascii="Cambria Math" w:hAnsi="Cambria Math"/>
@@ -14324,7 +14262,7 @@
                 <m:num>
                   <m:r>
                     <m:rPr>
-                      <m:sty m:val="p"/>
+                      <m:nor/>
                     </m:rPr>
                     <w:rPr>
                       <w:rFonts w:ascii="Cambria Math" w:hAnsi="Cambria Math"/>
@@ -14336,7 +14274,7 @@
                 <m:den>
                   <m:r>
                     <m:rPr>
-                      <m:sty m:val="p"/>
+                      <m:nor/>
                     </m:rPr>
                     <w:rPr>
                       <w:rFonts w:ascii="Cambria Math" w:hAnsi="Cambria Math"/>
@@ -14946,7 +14884,7 @@
                 <w:color w:val="FFFFFF"/>
                 <w:sz w:val="32"/>
               </w:rPr>
-              <w:t>Section 3: Mixed: Chapters 1-8 (continued)</w:t>
+              <w:t>Section 3: Mixed Topics (Chapters 1–8) (continued)</w:t>
             </w:r>
           </w:p>
         </w:tc>
@@ -15645,7 +15583,7 @@
                 <w:color w:val="FFFFFF"/>
                 <w:sz w:val="32"/>
               </w:rPr>
-              <w:t>Section 3: Mixed: Chapters 1-8 (continued)</w:t>
+              <w:t>Section 3: Mixed Topics (Chapters 1–8) (continued)</w:t>
             </w:r>
           </w:p>
         </w:tc>
@@ -15954,7 +15892,7 @@
                       <m:num>
                         <m:r>
                           <m:rPr>
-                            <m:sty m:val="p"/>
+                            <m:nor/>
                           </m:rPr>
                           <w:rPr>
                             <w:rFonts w:ascii="Cambria Math" w:hAnsi="Cambria Math"/>
@@ -15966,7 +15904,7 @@
                       <m:den>
                         <m:r>
                           <m:rPr>
-                            <m:sty m:val="p"/>
+                            <m:nor/>
                           </m:rPr>
                           <w:rPr>
                             <w:rFonts w:ascii="Cambria Math" w:hAnsi="Cambria Math"/>
@@ -16025,7 +15963,7 @@
                       <m:num>
                         <m:r>
                           <m:rPr>
-                            <m:sty m:val="p"/>
+                            <m:nor/>
                           </m:rPr>
                           <w:rPr>
                             <w:rFonts w:ascii="Cambria Math" w:hAnsi="Cambria Math"/>
@@ -16037,7 +15975,7 @@
                       <m:den>
                         <m:r>
                           <m:rPr>
-                            <m:sty m:val="p"/>
+                            <m:nor/>
                           </m:rPr>
                           <w:rPr>
                             <w:rFonts w:ascii="Cambria Math" w:hAnsi="Cambria Math"/>
@@ -16096,7 +16034,7 @@
                       <m:num>
                         <m:r>
                           <m:rPr>
-                            <m:sty m:val="p"/>
+                            <m:nor/>
                           </m:rPr>
                           <w:rPr>
                             <w:rFonts w:ascii="Cambria Math" w:hAnsi="Cambria Math"/>
@@ -16108,7 +16046,7 @@
                       <m:den>
                         <m:r>
                           <m:rPr>
-                            <m:sty m:val="p"/>
+                            <m:nor/>
                           </m:rPr>
                           <w:rPr>
                             <w:rFonts w:ascii="Cambria Math" w:hAnsi="Cambria Math"/>
@@ -16133,8 +16071,8 @@
                   <w:r>
                     <w:drawing>
                       <wp:inline xmlns:a="http://schemas.openxmlformats.org/drawingml/2006/main" xmlns:pic="http://schemas.openxmlformats.org/drawingml/2006/picture" distT="0" distB="0" distL="0" distR="0">
-                        <wp:extent cx="1213560" cy="1981137"/>
-                        <wp:docPr id="19" name="Picture 19"/>
+                        <wp:extent cx="1213560" cy="1966389"/>
+                        <wp:docPr id="18" name="Picture 18"/>
                         <wp:cNvGraphicFramePr>
                           <a:graphicFrameLocks noChangeAspect="1"/>
                         </wp:cNvGraphicFramePr>
@@ -16146,7 +16084,7 @@
                                 <pic:cNvPicPr/>
                               </pic:nvPicPr>
                               <pic:blipFill>
-                                <a:blip r:embed="rId28"/>
+                                <a:blip r:embed="rId27"/>
                                 <a:stretch>
                                   <a:fillRect/>
                                 </a:stretch>
@@ -16154,7 +16092,7 @@
                               <pic:spPr>
                                 <a:xfrm>
                                   <a:off x="0" y="0"/>
-                                  <a:ext cx="1213560" cy="1981137"/>
+                                  <a:ext cx="1213560" cy="1966389"/>
                                 </a:xfrm>
                                 <a:prstGeom prst="rect"/>
                               </pic:spPr>

</xml_diff>

<commit_message>
Yearly exam: Section 2 Q2 is now the triangle area formula
Replace the measuring-cylinder precision and absolute error question with
a multiple choice on the formula for the area of a triangle (A = 2bh,
A = bh, A = ½bh, A = ½(b + h); answer C), with a triangle showing b and
the dashed perpendicular height h. The option order matches the
hand-edited PDF the teacher already has. Rebuilt the exam and marking
guide (PDF and Word); still 72 marks, 49 green and 23 blue. The
measuring cylinder figure is removed with the old question.

Co-Authored-By: Claude Opus 5.5 <noreply@anthropic.com>
Claude-Session: https://claude.ai/code/session_01By1YqxqEqDpfEC8Ji6utSM
</commit_message>
<xml_diff>
--- a/Yearly exam 2026/Year9-5.2-Yearly-Exam-2026.docx
+++ b/Yearly exam 2026/Year9-5.2-Yearly-Exam-2026.docx
@@ -3387,7 +3387,7 @@
                   <w:r>
                     <w:drawing>
                       <wp:inline xmlns:a="http://schemas.openxmlformats.org/drawingml/2006/main" xmlns:pic="http://schemas.openxmlformats.org/drawingml/2006/picture" distT="0" distB="0" distL="0" distR="0">
-                        <wp:extent cx="1938960" cy="1173661"/>
+                        <wp:extent cx="1938960" cy="1161561"/>
                         <wp:docPr id="6" name="Picture 6"/>
                         <wp:cNvGraphicFramePr>
                           <a:graphicFrameLocks noChangeAspect="1"/>
@@ -3408,7 +3408,7 @@
                               <pic:spPr>
                                 <a:xfrm>
                                   <a:off x="0" y="0"/>
-                                  <a:ext cx="1938960" cy="1173661"/>
+                                  <a:ext cx="1938960" cy="1161561"/>
                                 </a:xfrm>
                                 <a:prstGeom prst="rect"/>
                               </pic:spPr>
@@ -4271,13 +4271,13 @@
               <w:tblLook w:firstColumn="1" w:firstRow="1" w:lastColumn="0" w:lastRow="0" w:noHBand="0" w:noVBand="1" w:val="04A0"/>
             </w:tblPr>
             <w:tblGrid>
-              <w:gridCol w:w="7326"/>
-              <w:gridCol w:w="1705"/>
+              <w:gridCol w:w="7058"/>
+              <w:gridCol w:w="1973"/>
             </w:tblGrid>
             <w:tr>
               <w:tc>
                 <w:tcPr>
-                  <w:tcW w:type="dxa" w:w="7326"/>
+                  <w:tcW w:type="dxa" w:w="7058"/>
                   <w:tcMar>
                     <w:right w:w="227" w:type="dxa"/>
                   </w:tcMar>
@@ -4295,7 +4295,7 @@
                       <w:i w:val="0"/>
                       <w:sz w:val="22"/>
                     </w:rPr>
-                    <w:t>The scale on this measuring cylinder is shown.</w:t>
+                    <w:t>Select the correct formula for the area of a triangle.</w:t>
                   </w:r>
                 </w:p>
                 <w:p>
@@ -4310,14 +4310,17 @@
                       <w:i w:val="0"/>
                       <w:sz w:val="22"/>
                     </w:rPr>
-                    <w:t>What is the absolute error of a reading taken with this measuring cylinder?</w:t>
+                    <w:t xml:space="preserve">Note: </w:t>
                   </w:r>
-                </w:p>
-                <w:p>
-                  <w:pPr>
-                    <w:spacing w:before="0" w:after="68" w:line="240" w:lineRule="auto"/>
-                    <w:jc w:val="center"/>
-                  </w:pPr>
+                  <w:r>
+                    <w:rPr>
+                      <w:rFonts w:ascii="Cambria" w:hAnsi="Cambria" w:cs="Cambria" w:eastAsia="Cambria"/>
+                      <w:b w:val="0"/>
+                      <w:i/>
+                      <w:sz w:val="22"/>
+                    </w:rPr>
+                    <w:t>b</w:t>
+                  </w:r>
                   <w:r>
                     <w:rPr>
                       <w:rFonts w:ascii="Cambria" w:hAnsi="Cambria" w:cs="Cambria" w:eastAsia="Cambria"/>
@@ -4325,7 +4328,25 @@
                       <w:i w:val="0"/>
                       <w:sz w:val="22"/>
                     </w:rPr>
-                    <w:t>Note: absolute error = ½ × precision (the smallest marked unit on the scale)</w:t>
+                    <w:t xml:space="preserve"> is the base and </w:t>
+                  </w:r>
+                  <w:r>
+                    <w:rPr>
+                      <w:rFonts w:ascii="Cambria" w:hAnsi="Cambria" w:cs="Cambria" w:eastAsia="Cambria"/>
+                      <w:b w:val="0"/>
+                      <w:i/>
+                      <w:sz w:val="22"/>
+                    </w:rPr>
+                    <w:t>h</w:t>
+                  </w:r>
+                  <w:r>
+                    <w:rPr>
+                      <w:rFonts w:ascii="Cambria" w:hAnsi="Cambria" w:cs="Cambria" w:eastAsia="Cambria"/>
+                      <w:b w:val="0"/>
+                      <w:i w:val="0"/>
+                      <w:sz w:val="22"/>
+                    </w:rPr>
+                    <w:t xml:space="preserve"> is the perpendicular height</w:t>
                   </w:r>
                 </w:p>
                 <w:p>
@@ -4335,7 +4356,7 @@
                 </w:p>
                 <w:tbl>
                   <w:tblPr>
-                    <w:tblW w:w="6362" w:type="dxa"/>
+                    <w:tblW w:w="6094" w:type="dxa"/>
                     <w:tblInd w:w="510" w:type="dxa"/>
                     <w:tblBorders>
                       <w:top w:val="nil"/>
@@ -4355,15 +4376,15 @@
                     <w:tblLook w:firstColumn="1" w:firstRow="1" w:lastColumn="0" w:lastRow="0" w:noHBand="0" w:noVBand="1" w:val="04A0"/>
                   </w:tblPr>
                   <w:tblGrid>
-                    <w:gridCol w:w="1591"/>
-                    <w:gridCol w:w="1591"/>
-                    <w:gridCol w:w="1591"/>
-                    <w:gridCol w:w="1591"/>
+                    <w:gridCol w:w="1524"/>
+                    <w:gridCol w:w="1524"/>
+                    <w:gridCol w:w="1524"/>
+                    <w:gridCol w:w="1524"/>
                   </w:tblGrid>
                   <w:tr>
                     <w:tc>
                       <w:tcPr>
-                        <w:tcW w:type="dxa" w:w="1591"/>
+                        <w:tcW w:type="dxa" w:w="1524"/>
                       </w:tcPr>
                       <w:p>
                         <w:pPr>
@@ -4393,16 +4414,34 @@
                           <w:rPr>
                             <w:rFonts w:ascii="Cambria" w:hAnsi="Cambria" w:cs="Cambria" w:eastAsia="Cambria"/>
                             <w:b w:val="0"/>
+                            <w:i/>
+                            <w:sz w:val="22"/>
+                          </w:rPr>
+                          <w:t>A</w:t>
+                        </w:r>
+                        <w:r>
+                          <w:rPr>
+                            <w:rFonts w:ascii="Cambria" w:hAnsi="Cambria" w:cs="Cambria" w:eastAsia="Cambria"/>
+                            <w:b w:val="0"/>
                             <w:i w:val="0"/>
                             <w:sz w:val="22"/>
                           </w:rPr>
-                          <w:t>±25 mL</w:t>
+                          <w:t xml:space="preserve"> = 2</w:t>
+                        </w:r>
+                        <w:r>
+                          <w:rPr>
+                            <w:rFonts w:ascii="Cambria" w:hAnsi="Cambria" w:cs="Cambria" w:eastAsia="Cambria"/>
+                            <w:b w:val="0"/>
+                            <w:i/>
+                            <w:sz w:val="22"/>
+                          </w:rPr>
+                          <w:t>bh</w:t>
                         </w:r>
                       </w:p>
                     </w:tc>
                     <w:tc>
                       <w:tcPr>
-                        <w:tcW w:type="dxa" w:w="1591"/>
+                        <w:tcW w:type="dxa" w:w="1524"/>
                       </w:tcPr>
                       <w:p>
                         <w:pPr>
@@ -4432,16 +4471,34 @@
                           <w:rPr>
                             <w:rFonts w:ascii="Cambria" w:hAnsi="Cambria" w:cs="Cambria" w:eastAsia="Cambria"/>
                             <w:b w:val="0"/>
+                            <w:i/>
+                            <w:sz w:val="22"/>
+                          </w:rPr>
+                          <w:t>A</w:t>
+                        </w:r>
+                        <w:r>
+                          <w:rPr>
+                            <w:rFonts w:ascii="Cambria" w:hAnsi="Cambria" w:cs="Cambria" w:eastAsia="Cambria"/>
+                            <w:b w:val="0"/>
                             <w:i w:val="0"/>
                             <w:sz w:val="22"/>
                           </w:rPr>
-                          <w:t>±50 mL</w:t>
+                          <w:t xml:space="preserve"> = </w:t>
+                        </w:r>
+                        <w:r>
+                          <w:rPr>
+                            <w:rFonts w:ascii="Cambria" w:hAnsi="Cambria" w:cs="Cambria" w:eastAsia="Cambria"/>
+                            <w:b w:val="0"/>
+                            <w:i/>
+                            <w:sz w:val="22"/>
+                          </w:rPr>
+                          <w:t>bh</w:t>
                         </w:r>
                       </w:p>
                     </w:tc>
                     <w:tc>
                       <w:tcPr>
-                        <w:tcW w:type="dxa" w:w="1591"/>
+                        <w:tcW w:type="dxa" w:w="1524"/>
                       </w:tcPr>
                       <w:p>
                         <w:pPr>
@@ -4471,16 +4528,34 @@
                           <w:rPr>
                             <w:rFonts w:ascii="Cambria" w:hAnsi="Cambria" w:cs="Cambria" w:eastAsia="Cambria"/>
                             <w:b w:val="0"/>
+                            <w:i/>
+                            <w:sz w:val="22"/>
+                          </w:rPr>
+                          <w:t>A</w:t>
+                        </w:r>
+                        <w:r>
+                          <w:rPr>
+                            <w:rFonts w:ascii="Cambria" w:hAnsi="Cambria" w:cs="Cambria" w:eastAsia="Cambria"/>
+                            <w:b w:val="0"/>
                             <w:i w:val="0"/>
                             <w:sz w:val="22"/>
                           </w:rPr>
-                          <w:t>±100 mL</w:t>
+                          <w:t xml:space="preserve"> = ½</w:t>
+                        </w:r>
+                        <w:r>
+                          <w:rPr>
+                            <w:rFonts w:ascii="Cambria" w:hAnsi="Cambria" w:cs="Cambria" w:eastAsia="Cambria"/>
+                            <w:b w:val="0"/>
+                            <w:i/>
+                            <w:sz w:val="22"/>
+                          </w:rPr>
+                          <w:t>bh</w:t>
                         </w:r>
                       </w:p>
                     </w:tc>
                     <w:tc>
                       <w:tcPr>
-                        <w:tcW w:type="dxa" w:w="1591"/>
+                        <w:tcW w:type="dxa" w:w="1524"/>
                       </w:tcPr>
                       <w:p>
                         <w:pPr>
@@ -4510,10 +4585,55 @@
                           <w:rPr>
                             <w:rFonts w:ascii="Cambria" w:hAnsi="Cambria" w:cs="Cambria" w:eastAsia="Cambria"/>
                             <w:b w:val="0"/>
+                            <w:i/>
+                            <w:sz w:val="22"/>
+                          </w:rPr>
+                          <w:t>A</w:t>
+                        </w:r>
+                        <w:r>
+                          <w:rPr>
+                            <w:rFonts w:ascii="Cambria" w:hAnsi="Cambria" w:cs="Cambria" w:eastAsia="Cambria"/>
+                            <w:b w:val="0"/>
                             <w:i w:val="0"/>
                             <w:sz w:val="22"/>
                           </w:rPr>
-                          <w:t>±0.5 mL</w:t>
+                          <w:t xml:space="preserve"> = ½(</w:t>
+                        </w:r>
+                        <w:r>
+                          <w:rPr>
+                            <w:rFonts w:ascii="Cambria" w:hAnsi="Cambria" w:cs="Cambria" w:eastAsia="Cambria"/>
+                            <w:b w:val="0"/>
+                            <w:i/>
+                            <w:sz w:val="22"/>
+                          </w:rPr>
+                          <w:t>b</w:t>
+                        </w:r>
+                        <w:r>
+                          <w:rPr>
+                            <w:rFonts w:ascii="Cambria" w:hAnsi="Cambria" w:cs="Cambria" w:eastAsia="Cambria"/>
+                            <w:b w:val="0"/>
+                            <w:i w:val="0"/>
+                            <w:sz w:val="22"/>
+                          </w:rPr>
+                          <w:t xml:space="preserve"> + </w:t>
+                        </w:r>
+                        <w:r>
+                          <w:rPr>
+                            <w:rFonts w:ascii="Cambria" w:hAnsi="Cambria" w:cs="Cambria" w:eastAsia="Cambria"/>
+                            <w:b w:val="0"/>
+                            <w:i/>
+                            <w:sz w:val="22"/>
+                          </w:rPr>
+                          <w:t>h</w:t>
+                        </w:r>
+                        <w:r>
+                          <w:rPr>
+                            <w:rFonts w:ascii="Cambria" w:hAnsi="Cambria" w:cs="Cambria" w:eastAsia="Cambria"/>
+                            <w:b w:val="0"/>
+                            <w:i w:val="0"/>
+                            <w:sz w:val="22"/>
+                          </w:rPr>
+                          <w:t>)</w:t>
                         </w:r>
                       </w:p>
                     </w:tc>
@@ -4527,7 +4647,7 @@
               </w:tc>
               <w:tc>
                 <w:tcPr>
-                  <w:tcW w:type="dxa" w:w="1705"/>
+                  <w:tcW w:type="dxa" w:w="1973"/>
                   <w:vAlign w:val="center"/>
                 </w:tcPr>
                 <w:p>
@@ -4538,7 +4658,7 @@
                   <w:r>
                     <w:drawing>
                       <wp:inline xmlns:a="http://schemas.openxmlformats.org/drawingml/2006/main" xmlns:pic="http://schemas.openxmlformats.org/drawingml/2006/picture" distT="0" distB="0" distL="0" distR="0">
-                        <wp:extent cx="1010879" cy="1607116"/>
+                        <wp:extent cx="1180800" cy="1075102"/>
                         <wp:docPr id="7" name="Picture 7"/>
                         <wp:cNvGraphicFramePr>
                           <a:graphicFrameLocks noChangeAspect="1"/>
@@ -4559,7 +4679,7 @@
                               <pic:spPr>
                                 <a:xfrm>
                                   <a:off x="0" y="0"/>
-                                  <a:ext cx="1010879" cy="1607116"/>
+                                  <a:ext cx="1180800" cy="1075102"/>
                                 </a:xfrm>
                                 <a:prstGeom prst="rect"/>
                               </pic:spPr>
@@ -4948,7 +5068,7 @@
                   <w:r>
                     <w:drawing>
                       <wp:inline xmlns:a="http://schemas.openxmlformats.org/drawingml/2006/main" xmlns:pic="http://schemas.openxmlformats.org/drawingml/2006/picture" distT="0" distB="0" distL="0" distR="0">
-                        <wp:extent cx="1842480" cy="826988"/>
+                        <wp:extent cx="1842480" cy="817867"/>
                         <wp:docPr id="8" name="Picture 8"/>
                         <wp:cNvGraphicFramePr>
                           <a:graphicFrameLocks noChangeAspect="1"/>
@@ -4969,7 +5089,7 @@
                               <pic:spPr>
                                 <a:xfrm>
                                   <a:off x="0" y="0"/>
-                                  <a:ext cx="1842480" cy="826988"/>
+                                  <a:ext cx="1842480" cy="817867"/>
                                 </a:xfrm>
                                 <a:prstGeom prst="rect"/>
                               </pic:spPr>
@@ -5403,7 +5523,7 @@
                   <w:r>
                     <w:drawing>
                       <wp:inline xmlns:a="http://schemas.openxmlformats.org/drawingml/2006/main" xmlns:pic="http://schemas.openxmlformats.org/drawingml/2006/picture" distT="0" distB="0" distL="0" distR="0">
-                        <wp:extent cx="1362240" cy="1465165"/>
+                        <wp:extent cx="1362240" cy="1456083"/>
                         <wp:docPr id="9" name="Picture 9"/>
                         <wp:cNvGraphicFramePr>
                           <a:graphicFrameLocks noChangeAspect="1"/>
@@ -5424,7 +5544,7 @@
                               <pic:spPr>
                                 <a:xfrm>
                                   <a:off x="0" y="0"/>
-                                  <a:ext cx="1362240" cy="1465165"/>
+                                  <a:ext cx="1362240" cy="1456083"/>
                                 </a:xfrm>
                                 <a:prstGeom prst="rect"/>
                               </pic:spPr>
@@ -5465,92 +5585,6 @@
                 <w:sz w:val="22"/>
               </w:rPr>
               <w:t>1</w:t>
-            </w:r>
-          </w:p>
-        </w:tc>
-      </w:tr>
-    </w:tbl>
-    <w:p>
-      <w:pPr>
-        <w:pageBreakBefore/>
-        <w:spacing w:before="0" w:after="0" w:lineRule="exact" w:line="20"/>
-      </w:pPr>
-      <w:r>
-        <w:rPr>
-          <w:rFonts w:ascii="Cambria" w:hAnsi="Cambria" w:cs="Cambria" w:eastAsia="Cambria"/>
-          <w:sz w:val="2"/>
-        </w:rPr>
-      </w:r>
-    </w:p>
-    <w:tbl>
-      <w:tblPr>
-        <w:tblW w:w="10431" w:type="dxa"/>
-        <w:tblBorders>
-          <w:top w:val="single" w:sz="6" w:space="0" w:color="1F1F1F"/>
-          <w:left w:val="single" w:sz="6" w:space="0" w:color="1F1F1F"/>
-          <w:bottom w:val="single" w:sz="6" w:space="0" w:color="1F1F1F"/>
-          <w:right w:val="single" w:sz="6" w:space="0" w:color="1F1F1F"/>
-          <w:insideH w:val="single" w:sz="6" w:space="0" w:color="1F1F1F"/>
-          <w:insideV w:val="single" w:sz="6" w:space="0" w:color="1F1F1F"/>
-        </w:tblBorders>
-        <w:tblLayout w:type="fixed"/>
-        <w:tblCellMar>
-          <w:top w:w="68" w:type="dxa"/>
-          <w:left w:w="91" w:type="dxa"/>
-          <w:bottom w:w="68" w:type="dxa"/>
-          <w:right w:w="91" w:type="dxa"/>
-        </w:tblCellMar>
-        <w:tblLook w:firstColumn="1" w:firstRow="1" w:lastColumn="0" w:lastRow="0" w:noHBand="0" w:noVBand="1" w:val="04A0"/>
-      </w:tblPr>
-      <w:tblGrid>
-        <w:gridCol w:w="380"/>
-        <w:gridCol w:w="3742"/>
-        <w:gridCol w:w="5630"/>
-        <w:gridCol w:w="680"/>
-      </w:tblGrid>
-      <w:tr>
-        <w:trPr>
-          <w:cantSplit/>
-          <w:trHeight w:val="663" w:hRule="atLeast"/>
-          <w:tblHeader/>
-        </w:trPr>
-        <w:tc>
-          <w:tcPr>
-            <w:tcW w:type="dxa" w:w="380"/>
-            <w:shd w:val="clear" w:color="auto" w:fill="0F3A63"/>
-            <w:tcMar>
-              <w:left w:w="17" w:type="dxa"/>
-              <w:right w:w="17" w:type="dxa"/>
-            </w:tcMar>
-            <w:vAlign w:val="center"/>
-          </w:tcPr>
-          <w:p>
-            <w:pPr>
-              <w:keepNext/>
-            </w:pPr>
-          </w:p>
-        </w:tc>
-        <w:tc>
-          <w:tcPr>
-            <w:tcW w:type="dxa" w:w="10052"/>
-            <w:gridSpan w:val="3"/>
-            <w:shd w:val="clear" w:color="auto" w:fill="0F3A63"/>
-            <w:vAlign w:val="center"/>
-          </w:tcPr>
-          <w:p>
-            <w:pPr>
-              <w:keepNext/>
-              <w:spacing w:before="0" w:after="0" w:line="240" w:lineRule="auto"/>
-              <w:jc w:val="center"/>
-            </w:pPr>
-            <w:r>
-              <w:rPr>
-                <w:rFonts w:ascii="Cambria" w:hAnsi="Cambria" w:cs="Cambria" w:eastAsia="Cambria"/>
-                <w:b/>
-                <w:color w:val="FFFFFF"/>
-                <w:sz w:val="32"/>
-              </w:rPr>
-              <w:t>Section 2: Surface area and volume (continued)</w:t>
             </w:r>
           </w:p>
         </w:tc>
@@ -5750,7 +5784,7 @@
             <w:r>
               <w:drawing>
                 <wp:inline xmlns:a="http://schemas.openxmlformats.org/drawingml/2006/main" xmlns:pic="http://schemas.openxmlformats.org/drawingml/2006/picture" distT="0" distB="0" distL="0" distR="0">
-                  <wp:extent cx="1804680" cy="1300342"/>
+                  <wp:extent cx="1804680" cy="1293808"/>
                   <wp:docPr id="10" name="Picture 10"/>
                   <wp:cNvGraphicFramePr>
                     <a:graphicFrameLocks noChangeAspect="1"/>
@@ -5771,7 +5805,7 @@
                         <pic:spPr>
                           <a:xfrm>
                             <a:off x="0" y="0"/>
-                            <a:ext cx="1804680" cy="1300342"/>
+                            <a:ext cx="1804680" cy="1293808"/>
                           </a:xfrm>
                           <a:prstGeom prst="rect"/>
                         </pic:spPr>
@@ -5940,6 +5974,187 @@
                 <w:sz w:val="22"/>
               </w:rPr>
               <w:t>1</w:t>
+            </w:r>
+          </w:p>
+        </w:tc>
+      </w:tr>
+    </w:tbl>
+    <w:p>
+      <w:pPr>
+        <w:pageBreakBefore/>
+        <w:spacing w:before="0" w:after="0" w:lineRule="exact" w:line="20"/>
+      </w:pPr>
+      <w:r>
+        <w:rPr>
+          <w:rFonts w:ascii="Cambria" w:hAnsi="Cambria" w:cs="Cambria" w:eastAsia="Cambria"/>
+          <w:sz w:val="2"/>
+        </w:rPr>
+      </w:r>
+    </w:p>
+    <w:tbl>
+      <w:tblPr>
+        <w:tblW w:w="10431" w:type="dxa"/>
+        <w:tblBorders>
+          <w:top w:val="single" w:sz="6" w:space="0" w:color="1F1F1F"/>
+          <w:left w:val="single" w:sz="6" w:space="0" w:color="1F1F1F"/>
+          <w:bottom w:val="single" w:sz="6" w:space="0" w:color="1F1F1F"/>
+          <w:right w:val="single" w:sz="6" w:space="0" w:color="1F1F1F"/>
+          <w:insideH w:val="single" w:sz="6" w:space="0" w:color="1F1F1F"/>
+          <w:insideV w:val="single" w:sz="6" w:space="0" w:color="1F1F1F"/>
+        </w:tblBorders>
+        <w:tblLayout w:type="fixed"/>
+        <w:tblCellMar>
+          <w:top w:w="68" w:type="dxa"/>
+          <w:left w:w="91" w:type="dxa"/>
+          <w:bottom w:w="68" w:type="dxa"/>
+          <w:right w:w="91" w:type="dxa"/>
+        </w:tblCellMar>
+        <w:tblLook w:firstColumn="1" w:firstRow="1" w:lastColumn="0" w:lastRow="0" w:noHBand="0" w:noVBand="1" w:val="04A0"/>
+      </w:tblPr>
+      <w:tblGrid>
+        <w:gridCol w:w="380"/>
+        <w:gridCol w:w="3742"/>
+        <w:gridCol w:w="5630"/>
+        <w:gridCol w:w="680"/>
+      </w:tblGrid>
+      <w:tr>
+        <w:trPr>
+          <w:cantSplit/>
+          <w:trHeight w:val="663" w:hRule="atLeast"/>
+          <w:tblHeader/>
+        </w:trPr>
+        <w:tc>
+          <w:tcPr>
+            <w:tcW w:type="dxa" w:w="380"/>
+            <w:shd w:val="clear" w:color="auto" w:fill="0F3A63"/>
+            <w:tcMar>
+              <w:left w:w="17" w:type="dxa"/>
+              <w:right w:w="17" w:type="dxa"/>
+            </w:tcMar>
+            <w:vAlign w:val="center"/>
+          </w:tcPr>
+          <w:p>
+            <w:pPr>
+              <w:keepNext/>
+            </w:pPr>
+          </w:p>
+        </w:tc>
+        <w:tc>
+          <w:tcPr>
+            <w:tcW w:type="dxa" w:w="10052"/>
+            <w:gridSpan w:val="3"/>
+            <w:shd w:val="clear" w:color="auto" w:fill="0F3A63"/>
+            <w:vAlign w:val="center"/>
+          </w:tcPr>
+          <w:p>
+            <w:pPr>
+              <w:keepNext/>
+              <w:spacing w:before="0" w:after="0" w:line="240" w:lineRule="auto"/>
+              <w:jc w:val="center"/>
+            </w:pPr>
+            <w:r>
+              <w:rPr>
+                <w:rFonts w:ascii="Cambria" w:hAnsi="Cambria" w:cs="Cambria" w:eastAsia="Cambria"/>
+                <w:b/>
+                <w:color w:val="FFFFFF"/>
+                <w:sz w:val="32"/>
+              </w:rPr>
+              <w:t>Section 2: Surface area and volume (continued)</w:t>
+            </w:r>
+          </w:p>
+        </w:tc>
+      </w:tr>
+      <w:tr>
+        <w:trPr>
+          <w:cantSplit/>
+          <w:trHeight w:val="516" w:hRule="atLeast"/>
+          <w:tblHeader/>
+        </w:trPr>
+        <w:tc>
+          <w:tcPr>
+            <w:tcW w:type="dxa" w:w="380"/>
+            <w:shd w:val="clear" w:color="auto" w:fill="EEF4FB"/>
+            <w:tcMar>
+              <w:left w:w="23" w:type="dxa"/>
+              <w:right w:w="23" w:type="dxa"/>
+            </w:tcMar>
+            <w:vAlign w:val="center"/>
+          </w:tcPr>
+          <w:p>
+            <w:pPr>
+              <w:keepNext/>
+              <w:spacing w:before="0" w:after="0" w:line="240" w:lineRule="auto"/>
+              <w:jc w:val="center"/>
+            </w:pPr>
+          </w:p>
+        </w:tc>
+        <w:tc>
+          <w:tcPr>
+            <w:tcW w:type="dxa" w:w="3742"/>
+            <w:shd w:val="clear" w:color="auto" w:fill="EEF4FB"/>
+            <w:vAlign w:val="center"/>
+          </w:tcPr>
+          <w:p>
+            <w:pPr>
+              <w:keepNext/>
+              <w:spacing w:before="0" w:after="0" w:line="240" w:lineRule="auto"/>
+              <w:jc w:val="center"/>
+            </w:pPr>
+            <w:r>
+              <w:rPr>
+                <w:rFonts w:ascii="Cambria" w:hAnsi="Cambria" w:cs="Cambria" w:eastAsia="Cambria"/>
+                <w:b/>
+                <w:sz w:val="22"/>
+              </w:rPr>
+              <w:t>Question</w:t>
+            </w:r>
+          </w:p>
+        </w:tc>
+        <w:tc>
+          <w:tcPr>
+            <w:tcW w:type="dxa" w:w="5630"/>
+            <w:shd w:val="clear" w:color="auto" w:fill="EEF4FB"/>
+            <w:vAlign w:val="center"/>
+          </w:tcPr>
+          <w:p>
+            <w:pPr>
+              <w:keepNext/>
+              <w:spacing w:before="0" w:after="0" w:line="240" w:lineRule="auto"/>
+              <w:jc w:val="center"/>
+            </w:pPr>
+            <w:r>
+              <w:rPr>
+                <w:rFonts w:ascii="Cambria" w:hAnsi="Cambria" w:cs="Cambria" w:eastAsia="Cambria"/>
+                <w:b/>
+                <w:sz w:val="22"/>
+              </w:rPr>
+              <w:t>Working Out</w:t>
+            </w:r>
+          </w:p>
+        </w:tc>
+        <w:tc>
+          <w:tcPr>
+            <w:tcW w:type="dxa" w:w="680"/>
+            <w:shd w:val="clear" w:color="auto" w:fill="EEF4FB"/>
+            <w:tcMar>
+              <w:left w:w="23" w:type="dxa"/>
+              <w:right w:w="23" w:type="dxa"/>
+            </w:tcMar>
+            <w:vAlign w:val="center"/>
+          </w:tcPr>
+          <w:p>
+            <w:pPr>
+              <w:keepNext/>
+              <w:spacing w:before="0" w:after="0" w:line="240" w:lineRule="auto"/>
+              <w:jc w:val="center"/>
+            </w:pPr>
+            <w:r>
+              <w:rPr>
+                <w:rFonts w:ascii="Cambria" w:hAnsi="Cambria" w:cs="Cambria" w:eastAsia="Cambria"/>
+                <w:b/>
+                <w:sz w:val="22"/>
+              </w:rPr>
+              <w:t>Mark</w:t>
             </w:r>
           </w:p>
         </w:tc>
@@ -6301,7 +6516,7 @@
             <w:r>
               <w:drawing>
                 <wp:inline xmlns:a="http://schemas.openxmlformats.org/drawingml/2006/main" xmlns:pic="http://schemas.openxmlformats.org/drawingml/2006/picture" distT="0" distB="0" distL="0" distR="0">
-                  <wp:extent cx="1064520" cy="1206255"/>
+                  <wp:extent cx="1064520" cy="1197208"/>
                   <wp:docPr id="12" name="Picture 12"/>
                   <wp:cNvGraphicFramePr>
                     <a:graphicFrameLocks noChangeAspect="1"/>
@@ -6322,7 +6537,7 @@
                         <pic:spPr>
                           <a:xfrm>
                             <a:off x="0" y="0"/>
-                            <a:ext cx="1064520" cy="1206255"/>
+                            <a:ext cx="1064520" cy="1197208"/>
                           </a:xfrm>
                           <a:prstGeom prst="rect"/>
                         </pic:spPr>
@@ -6940,7 +7155,7 @@
                   <w:r>
                     <w:drawing>
                       <wp:inline xmlns:a="http://schemas.openxmlformats.org/drawingml/2006/main" xmlns:pic="http://schemas.openxmlformats.org/drawingml/2006/picture" distT="0" distB="0" distL="0" distR="0">
-                        <wp:extent cx="1869840" cy="1205075"/>
+                        <wp:extent cx="1869840" cy="1195969"/>
                         <wp:docPr id="13" name="Picture 13"/>
                         <wp:cNvGraphicFramePr>
                           <a:graphicFrameLocks noChangeAspect="1"/>
@@ -6961,7 +7176,7 @@
                               <pic:spPr>
                                 <a:xfrm>
                                   <a:off x="0" y="0"/>
-                                  <a:ext cx="1869840" cy="1205075"/>
+                                  <a:ext cx="1869840" cy="1195969"/>
                                 </a:xfrm>
                                 <a:prstGeom prst="rect"/>
                               </pic:spPr>
@@ -7535,7 +7750,7 @@
                   <w:r>
                     <w:drawing>
                       <wp:inline xmlns:a="http://schemas.openxmlformats.org/drawingml/2006/main" xmlns:pic="http://schemas.openxmlformats.org/drawingml/2006/picture" distT="0" distB="0" distL="0" distR="0">
-                        <wp:extent cx="2056320" cy="1088818"/>
+                        <wp:extent cx="2056320" cy="1079720"/>
                         <wp:docPr id="14" name="Picture 14"/>
                         <wp:cNvGraphicFramePr>
                           <a:graphicFrameLocks noChangeAspect="1"/>
@@ -7556,7 +7771,7 @@
                               <pic:spPr>
                                 <a:xfrm>
                                   <a:off x="0" y="0"/>
-                                  <a:ext cx="2056320" cy="1088818"/>
+                                  <a:ext cx="2056320" cy="1079720"/>
                                 </a:xfrm>
                                 <a:prstGeom prst="rect"/>
                               </pic:spPr>
@@ -8926,7 +9141,7 @@
                   <w:r>
                     <w:drawing>
                       <wp:inline xmlns:a="http://schemas.openxmlformats.org/drawingml/2006/main" xmlns:pic="http://schemas.openxmlformats.org/drawingml/2006/picture" distT="0" distB="0" distL="0" distR="0">
-                        <wp:extent cx="1897920" cy="1084958"/>
+                        <wp:extent cx="1897920" cy="1075891"/>
                         <wp:docPr id="15" name="Picture 15"/>
                         <wp:cNvGraphicFramePr>
                           <a:graphicFrameLocks noChangeAspect="1"/>
@@ -8947,7 +9162,7 @@
                               <pic:spPr>
                                 <a:xfrm>
                                   <a:off x="0" y="0"/>
-                                  <a:ext cx="1897920" cy="1084958"/>
+                                  <a:ext cx="1897920" cy="1075891"/>
                                 </a:xfrm>
                                 <a:prstGeom prst="rect"/>
                               </pic:spPr>
@@ -13049,7 +13264,7 @@
                   <w:r>
                     <w:drawing>
                       <wp:inline xmlns:a="http://schemas.openxmlformats.org/drawingml/2006/main" xmlns:pic="http://schemas.openxmlformats.org/drawingml/2006/picture" distT="0" distB="0" distL="0" distR="0">
-                        <wp:extent cx="1213560" cy="1981137"/>
+                        <wp:extent cx="1213560" cy="1972035"/>
                         <wp:docPr id="16" name="Picture 16"/>
                         <wp:cNvGraphicFramePr>
                           <a:graphicFrameLocks noChangeAspect="1"/>
@@ -13070,7 +13285,7 @@
                               <pic:spPr>
                                 <a:xfrm>
                                   <a:off x="0" y="0"/>
-                                  <a:ext cx="1213560" cy="1981137"/>
+                                  <a:ext cx="1213560" cy="1972035"/>
                                 </a:xfrm>
                                 <a:prstGeom prst="rect"/>
                               </pic:spPr>

</xml_diff>